<commit_message>
Rerun analysis pipeline, dashboard, and position memo with local 2025 HMDA data
</commit_message>
<xml_diff>
--- a/Submit/Project Audible Position Memo.docx
+++ b/Submit/Project Audible Position Memo.docx
@@ -217,7 +217,7 @@
           <w:sz w:val="19"/>
           <w:szCs w:val="19"/>
         </w:rPr>
-        <w:t xml:space="preserve">Sample: 2025 HMDA, conventional conforming 30-year fixed purchase loans; 173,033 loans from 14 fintech lenders (NYU Stern list) vs. 338,166 from 655 banks, with valid borrower data and DTI below 50% (lender-clustered 95% CI, full sample: +12.2 bps to +25.3 bps). 12 of 14 fintech lenders price above the bank median (11 by 5 bps or more). Rocket Mortgage is 47% of fintech loans, yet without it every risk cell still shows at least +13.5 bps.</w:t>
+        <w:t xml:space="preserve">Sample: 2025 HMDA, conventional conforming 30-year fixed purchase loans; 173,033 loans from 14 fintech lenders (NYU Stern list) vs. 338,166 from 655 banks, with valid borrower data and DTI below 50% (lender-clustered 95% CI: +11.5 bps to +23.3 bps). 12 of 14 fintech lenders price above the bank median (11 by 5 bps or more). Rocket Mortgage is 47% of fintech loans, yet without it every risk cell still shows at least +13.5 bps.</w:t>
       </w:r>
     </w:p>
     <w:p>
@@ -1515,11 +1515,20 @@
           <w:rFonts w:ascii="Calibri" w:hAnsi="Calibri" w:cs="Calibri"/>
           <w:b/>
           <w:bCs/>
-          <w:color w:val="B91C1C"/>
-          <w:sz w:val="19"/>
-          <w:szCs w:val="19"/>
-        </w:rPr>
-        <w:t xml:space="preserve">PENDING — rerun analyze_pricing.py and build_dashboard.py, then rebuild this memo: the Fintech vs. non-fintech nonbank result is not in the current outputs.</w:t>
+          <w:color w:val="1E293B"/>
+          <w:sz w:val="19"/>
+          <w:szCs w:val="19"/>
+        </w:rPr>
+        <w:t xml:space="preserve">Against non-fintech independent mortgage banks (600 lenders, 808,681 loans, same filters), the Fintech gap is -1.2 bps. </w:t>
+      </w:r>
+      <w:r>
+        <w:rPr>
+          <w:rFonts w:ascii="Calibri" w:hAnsi="Calibri" w:cs="Calibri"/>
+          <w:color w:val="1E293B"/>
+          <w:sz w:val="19"/>
+          <w:szCs w:val="19"/>
+        </w:rPr>
+        <w:t xml:space="preserve">Against other nonbanks the premium largely disappears, so the gap is mainly a nonbank effect. Borrowers still pay more than at banks, so the review stands, but members should be benchmarked against nonbank peers.</w:t>
       </w:r>
     </w:p>
     <w:p>

</xml_diff>

<commit_message>
Make Technical Memo more concise and straightforward
</commit_message>
<xml_diff>
--- a/Submit/Project Audible Position Memo.docx
+++ b/Submit/Project Audible Position Memo.docx
@@ -116,7 +116,7 @@
         <w:pBdr>
           <w:bottom w:val="single" w:sz="6" w:space="2" w:color="CBD5E1"/>
         </w:pBdr>
-        <w:spacing w:before="80" w:after="30" w:line="215" w:lineRule="auto"/>
+        <w:spacing w:before="85" w:after="32" w:line="218" w:lineRule="auto"/>
       </w:pPr>
       <w:r>
         <w:rPr>
@@ -169,7 +169,7 @@
         <w:pBdr>
           <w:bottom w:val="single" w:sz="6" w:space="2" w:color="CBD5E1"/>
         </w:pBdr>
-        <w:spacing w:before="80" w:after="30" w:line="215" w:lineRule="auto"/>
+        <w:spacing w:before="85" w:after="32" w:line="218" w:lineRule="auto"/>
       </w:pPr>
       <w:r>
         <w:rPr>
@@ -186,7 +186,7 @@
     <w:p>
       <w:pPr>
         <w:ind w:left="180" w:hanging="180"/>
-        <w:spacing w:before="16" w:after="20" w:line="210" w:lineRule="auto"/>
+        <w:spacing w:before="18" w:after="22" w:line="214" w:lineRule="auto"/>
       </w:pPr>
       <w:r>
         <w:rPr>
@@ -223,7 +223,7 @@
     <w:p>
       <w:pPr>
         <w:ind w:left="180" w:hanging="180"/>
-        <w:spacing w:before="16" w:after="20" w:line="210" w:lineRule="auto"/>
+        <w:spacing w:before="18" w:after="22" w:line="214" w:lineRule="auto"/>
       </w:pPr>
       <w:r>
         <w:rPr>
@@ -260,7 +260,7 @@
     <w:p>
       <w:pPr>
         <w:ind w:left="180" w:hanging="180"/>
-        <w:spacing w:before="16" w:after="20" w:line="210" w:lineRule="auto"/>
+        <w:spacing w:before="18" w:after="22" w:line="214" w:lineRule="auto"/>
       </w:pPr>
       <w:r>
         <w:rPr>
@@ -319,15 +319,15 @@
             <w:tcW w:w="3700" w:type="dxa"/>
             <w:shd w:val="clear" w:color="auto" w:fill="F1F5F9"/>
             <w:tcMar>
-              <w:top w:w="28" w:type="dxa"/>
-              <w:bottom w:w="28" w:type="dxa"/>
-              <w:left w:w="65" w:type="dxa"/>
-              <w:right w:w="65" w:type="dxa"/>
-            </w:tcMar>
-          </w:tcPr>
-          <w:p>
-            <w:pPr>
-              <w:spacing w:before="8" w:after="8" w:line="195" w:lineRule="auto"/>
+              <w:top w:w="32" w:type="dxa"/>
+              <w:bottom w:w="32" w:type="dxa"/>
+              <w:left w:w="68" w:type="dxa"/>
+              <w:right w:w="68" w:type="dxa"/>
+            </w:tcMar>
+          </w:tcPr>
+          <w:p>
+            <w:pPr>
+              <w:spacing w:before="8" w:after="8" w:line="198" w:lineRule="auto"/>
             </w:pPr>
             <w:r>
               <w:rPr>
@@ -347,15 +347,15 @@
             <w:tcW w:w="1900" w:type="dxa"/>
             <w:shd w:val="clear" w:color="auto" w:fill="F1F5F9"/>
             <w:tcMar>
-              <w:top w:w="28" w:type="dxa"/>
-              <w:bottom w:w="28" w:type="dxa"/>
-              <w:left w:w="65" w:type="dxa"/>
-              <w:right w:w="65" w:type="dxa"/>
-            </w:tcMar>
-          </w:tcPr>
-          <w:p>
-            <w:pPr>
-              <w:spacing w:before="8" w:after="8" w:line="195" w:lineRule="auto"/>
+              <w:top w:w="32" w:type="dxa"/>
+              <w:bottom w:w="32" w:type="dxa"/>
+              <w:left w:w="68" w:type="dxa"/>
+              <w:right w:w="68" w:type="dxa"/>
+            </w:tcMar>
+          </w:tcPr>
+          <w:p>
+            <w:pPr>
+              <w:spacing w:before="8" w:after="8" w:line="198" w:lineRule="auto"/>
             </w:pPr>
             <w:r>
               <w:rPr>
@@ -375,15 +375,15 @@
             <w:tcW w:w="1500" w:type="dxa"/>
             <w:shd w:val="clear" w:color="auto" w:fill="F1F5F9"/>
             <w:tcMar>
-              <w:top w:w="28" w:type="dxa"/>
-              <w:bottom w:w="28" w:type="dxa"/>
-              <w:left w:w="65" w:type="dxa"/>
-              <w:right w:w="65" w:type="dxa"/>
-            </w:tcMar>
-          </w:tcPr>
-          <w:p>
-            <w:pPr>
-              <w:spacing w:before="8" w:after="8" w:line="195" w:lineRule="auto"/>
+              <w:top w:w="32" w:type="dxa"/>
+              <w:bottom w:w="32" w:type="dxa"/>
+              <w:left w:w="68" w:type="dxa"/>
+              <w:right w:w="68" w:type="dxa"/>
+            </w:tcMar>
+          </w:tcPr>
+          <w:p>
+            <w:pPr>
+              <w:spacing w:before="8" w:after="8" w:line="198" w:lineRule="auto"/>
             </w:pPr>
             <w:r>
               <w:rPr>
@@ -403,15 +403,15 @@
             <w:tcW w:w="1300" w:type="dxa"/>
             <w:shd w:val="clear" w:color="auto" w:fill="F1F5F9"/>
             <w:tcMar>
-              <w:top w:w="28" w:type="dxa"/>
-              <w:bottom w:w="28" w:type="dxa"/>
-              <w:left w:w="65" w:type="dxa"/>
-              <w:right w:w="65" w:type="dxa"/>
-            </w:tcMar>
-          </w:tcPr>
-          <w:p>
-            <w:pPr>
-              <w:spacing w:before="8" w:after="8" w:line="195" w:lineRule="auto"/>
+              <w:top w:w="32" w:type="dxa"/>
+              <w:bottom w:w="32" w:type="dxa"/>
+              <w:left w:w="68" w:type="dxa"/>
+              <w:right w:w="68" w:type="dxa"/>
+            </w:tcMar>
+          </w:tcPr>
+          <w:p>
+            <w:pPr>
+              <w:spacing w:before="8" w:after="8" w:line="198" w:lineRule="auto"/>
             </w:pPr>
             <w:r>
               <w:rPr>
@@ -431,15 +431,15 @@
             <w:tcW w:w="2112" w:type="dxa"/>
             <w:shd w:val="clear" w:color="auto" w:fill="F1F5F9"/>
             <w:tcMar>
-              <w:top w:w="28" w:type="dxa"/>
-              <w:bottom w:w="28" w:type="dxa"/>
-              <w:left w:w="65" w:type="dxa"/>
-              <w:right w:w="65" w:type="dxa"/>
-            </w:tcMar>
-          </w:tcPr>
-          <w:p>
-            <w:pPr>
-              <w:spacing w:before="8" w:after="8" w:line="195" w:lineRule="auto"/>
+              <w:top w:w="32" w:type="dxa"/>
+              <w:bottom w:w="32" w:type="dxa"/>
+              <w:left w:w="68" w:type="dxa"/>
+              <w:right w:w="68" w:type="dxa"/>
+            </w:tcMar>
+          </w:tcPr>
+          <w:p>
+            <w:pPr>
+              <w:spacing w:before="8" w:after="8" w:line="198" w:lineRule="auto"/>
             </w:pPr>
             <w:r>
               <w:rPr>
@@ -460,15 +460,15 @@
           <w:tcPr>
             <w:tcW w:w="3700" w:type="dxa"/>
             <w:tcMar>
-              <w:top w:w="28" w:type="dxa"/>
-              <w:bottom w:w="28" w:type="dxa"/>
-              <w:left w:w="65" w:type="dxa"/>
-              <w:right w:w="65" w:type="dxa"/>
-            </w:tcMar>
-          </w:tcPr>
-          <w:p>
-            <w:pPr>
-              <w:spacing w:before="8" w:after="8" w:line="195" w:lineRule="auto"/>
+              <w:top w:w="32" w:type="dxa"/>
+              <w:bottom w:w="32" w:type="dxa"/>
+              <w:left w:w="68" w:type="dxa"/>
+              <w:right w:w="68" w:type="dxa"/>
+            </w:tcMar>
+          </w:tcPr>
+          <w:p>
+            <w:pPr>
+              <w:spacing w:before="8" w:after="8" w:line="198" w:lineRule="auto"/>
             </w:pPr>
             <w:r>
               <w:rPr>
@@ -487,15 +487,15 @@
           <w:tcPr>
             <w:tcW w:w="1900" w:type="dxa"/>
             <w:tcMar>
-              <w:top w:w="28" w:type="dxa"/>
-              <w:bottom w:w="28" w:type="dxa"/>
-              <w:left w:w="65" w:type="dxa"/>
-              <w:right w:w="65" w:type="dxa"/>
-            </w:tcMar>
-          </w:tcPr>
-          <w:p>
-            <w:pPr>
-              <w:spacing w:before="8" w:after="8" w:line="195" w:lineRule="auto"/>
+              <w:top w:w="32" w:type="dxa"/>
+              <w:bottom w:w="32" w:type="dxa"/>
+              <w:left w:w="68" w:type="dxa"/>
+              <w:right w:w="68" w:type="dxa"/>
+            </w:tcMar>
+          </w:tcPr>
+          <w:p>
+            <w:pPr>
+              <w:spacing w:before="8" w:after="8" w:line="198" w:lineRule="auto"/>
             </w:pPr>
             <w:r>
               <w:rPr>
@@ -512,15 +512,15 @@
           <w:tcPr>
             <w:tcW w:w="1500" w:type="dxa"/>
             <w:tcMar>
-              <w:top w:w="28" w:type="dxa"/>
-              <w:bottom w:w="28" w:type="dxa"/>
-              <w:left w:w="65" w:type="dxa"/>
-              <w:right w:w="65" w:type="dxa"/>
-            </w:tcMar>
-          </w:tcPr>
-          <w:p>
-            <w:pPr>
-              <w:spacing w:before="8" w:after="8" w:line="195" w:lineRule="auto"/>
+              <w:top w:w="32" w:type="dxa"/>
+              <w:bottom w:w="32" w:type="dxa"/>
+              <w:left w:w="68" w:type="dxa"/>
+              <w:right w:w="68" w:type="dxa"/>
+            </w:tcMar>
+          </w:tcPr>
+          <w:p>
+            <w:pPr>
+              <w:spacing w:before="8" w:after="8" w:line="198" w:lineRule="auto"/>
             </w:pPr>
             <w:r>
               <w:rPr>
@@ -537,15 +537,15 @@
           <w:tcPr>
             <w:tcW w:w="1300" w:type="dxa"/>
             <w:tcMar>
-              <w:top w:w="28" w:type="dxa"/>
-              <w:bottom w:w="28" w:type="dxa"/>
-              <w:left w:w="65" w:type="dxa"/>
-              <w:right w:w="65" w:type="dxa"/>
-            </w:tcMar>
-          </w:tcPr>
-          <w:p>
-            <w:pPr>
-              <w:spacing w:before="8" w:after="8" w:line="195" w:lineRule="auto"/>
+              <w:top w:w="32" w:type="dxa"/>
+              <w:bottom w:w="32" w:type="dxa"/>
+              <w:left w:w="68" w:type="dxa"/>
+              <w:right w:w="68" w:type="dxa"/>
+            </w:tcMar>
+          </w:tcPr>
+          <w:p>
+            <w:pPr>
+              <w:spacing w:before="8" w:after="8" w:line="198" w:lineRule="auto"/>
             </w:pPr>
             <w:r>
               <w:rPr>
@@ -562,15 +562,15 @@
           <w:tcPr>
             <w:tcW w:w="2112" w:type="dxa"/>
             <w:tcMar>
-              <w:top w:w="28" w:type="dxa"/>
-              <w:bottom w:w="28" w:type="dxa"/>
-              <w:left w:w="65" w:type="dxa"/>
-              <w:right w:w="65" w:type="dxa"/>
-            </w:tcMar>
-          </w:tcPr>
-          <w:p>
-            <w:pPr>
-              <w:spacing w:before="8" w:after="8" w:line="195" w:lineRule="auto"/>
+              <w:top w:w="32" w:type="dxa"/>
+              <w:bottom w:w="32" w:type="dxa"/>
+              <w:left w:w="68" w:type="dxa"/>
+              <w:right w:w="68" w:type="dxa"/>
+            </w:tcMar>
+          </w:tcPr>
+          <w:p>
+            <w:pPr>
+              <w:spacing w:before="8" w:after="8" w:line="198" w:lineRule="auto"/>
             </w:pPr>
             <w:r>
               <w:rPr>
@@ -589,15 +589,15 @@
           <w:tcPr>
             <w:tcW w:w="3700" w:type="dxa"/>
             <w:tcMar>
-              <w:top w:w="28" w:type="dxa"/>
-              <w:bottom w:w="28" w:type="dxa"/>
-              <w:left w:w="65" w:type="dxa"/>
-              <w:right w:w="65" w:type="dxa"/>
-            </w:tcMar>
-          </w:tcPr>
-          <w:p>
-            <w:pPr>
-              <w:spacing w:before="8" w:after="8" w:line="195" w:lineRule="auto"/>
+              <w:top w:w="32" w:type="dxa"/>
+              <w:bottom w:w="32" w:type="dxa"/>
+              <w:left w:w="68" w:type="dxa"/>
+              <w:right w:w="68" w:type="dxa"/>
+            </w:tcMar>
+          </w:tcPr>
+          <w:p>
+            <w:pPr>
+              <w:spacing w:before="8" w:after="8" w:line="198" w:lineRule="auto"/>
             </w:pPr>
             <w:r>
               <w:rPr>
@@ -616,15 +616,15 @@
           <w:tcPr>
             <w:tcW w:w="1900" w:type="dxa"/>
             <w:tcMar>
-              <w:top w:w="28" w:type="dxa"/>
-              <w:bottom w:w="28" w:type="dxa"/>
-              <w:left w:w="65" w:type="dxa"/>
-              <w:right w:w="65" w:type="dxa"/>
-            </w:tcMar>
-          </w:tcPr>
-          <w:p>
-            <w:pPr>
-              <w:spacing w:before="8" w:after="8" w:line="195" w:lineRule="auto"/>
+              <w:top w:w="32" w:type="dxa"/>
+              <w:bottom w:w="32" w:type="dxa"/>
+              <w:left w:w="68" w:type="dxa"/>
+              <w:right w:w="68" w:type="dxa"/>
+            </w:tcMar>
+          </w:tcPr>
+          <w:p>
+            <w:pPr>
+              <w:spacing w:before="8" w:after="8" w:line="198" w:lineRule="auto"/>
             </w:pPr>
             <w:r>
               <w:rPr>
@@ -641,15 +641,15 @@
           <w:tcPr>
             <w:tcW w:w="1500" w:type="dxa"/>
             <w:tcMar>
-              <w:top w:w="28" w:type="dxa"/>
-              <w:bottom w:w="28" w:type="dxa"/>
-              <w:left w:w="65" w:type="dxa"/>
-              <w:right w:w="65" w:type="dxa"/>
-            </w:tcMar>
-          </w:tcPr>
-          <w:p>
-            <w:pPr>
-              <w:spacing w:before="8" w:after="8" w:line="195" w:lineRule="auto"/>
+              <w:top w:w="32" w:type="dxa"/>
+              <w:bottom w:w="32" w:type="dxa"/>
+              <w:left w:w="68" w:type="dxa"/>
+              <w:right w:w="68" w:type="dxa"/>
+            </w:tcMar>
+          </w:tcPr>
+          <w:p>
+            <w:pPr>
+              <w:spacing w:before="8" w:after="8" w:line="198" w:lineRule="auto"/>
             </w:pPr>
             <w:r>
               <w:rPr>
@@ -666,15 +666,15 @@
           <w:tcPr>
             <w:tcW w:w="1300" w:type="dxa"/>
             <w:tcMar>
-              <w:top w:w="28" w:type="dxa"/>
-              <w:bottom w:w="28" w:type="dxa"/>
-              <w:left w:w="65" w:type="dxa"/>
-              <w:right w:w="65" w:type="dxa"/>
-            </w:tcMar>
-          </w:tcPr>
-          <w:p>
-            <w:pPr>
-              <w:spacing w:before="8" w:after="8" w:line="195" w:lineRule="auto"/>
+              <w:top w:w="32" w:type="dxa"/>
+              <w:bottom w:w="32" w:type="dxa"/>
+              <w:left w:w="68" w:type="dxa"/>
+              <w:right w:w="68" w:type="dxa"/>
+            </w:tcMar>
+          </w:tcPr>
+          <w:p>
+            <w:pPr>
+              <w:spacing w:before="8" w:after="8" w:line="198" w:lineRule="auto"/>
             </w:pPr>
             <w:r>
               <w:rPr>
@@ -691,15 +691,15 @@
           <w:tcPr>
             <w:tcW w:w="2112" w:type="dxa"/>
             <w:tcMar>
-              <w:top w:w="28" w:type="dxa"/>
-              <w:bottom w:w="28" w:type="dxa"/>
-              <w:left w:w="65" w:type="dxa"/>
-              <w:right w:w="65" w:type="dxa"/>
-            </w:tcMar>
-          </w:tcPr>
-          <w:p>
-            <w:pPr>
-              <w:spacing w:before="8" w:after="8" w:line="195" w:lineRule="auto"/>
+              <w:top w:w="32" w:type="dxa"/>
+              <w:bottom w:w="32" w:type="dxa"/>
+              <w:left w:w="68" w:type="dxa"/>
+              <w:right w:w="68" w:type="dxa"/>
+            </w:tcMar>
+          </w:tcPr>
+          <w:p>
+            <w:pPr>
+              <w:spacing w:before="8" w:after="8" w:line="198" w:lineRule="auto"/>
             </w:pPr>
             <w:r>
               <w:rPr>
@@ -718,15 +718,15 @@
           <w:tcPr>
             <w:tcW w:w="3700" w:type="dxa"/>
             <w:tcMar>
-              <w:top w:w="28" w:type="dxa"/>
-              <w:bottom w:w="28" w:type="dxa"/>
-              <w:left w:w="65" w:type="dxa"/>
-              <w:right w:w="65" w:type="dxa"/>
-            </w:tcMar>
-          </w:tcPr>
-          <w:p>
-            <w:pPr>
-              <w:spacing w:before="8" w:after="8" w:line="195" w:lineRule="auto"/>
+              <w:top w:w="32" w:type="dxa"/>
+              <w:bottom w:w="32" w:type="dxa"/>
+              <w:left w:w="68" w:type="dxa"/>
+              <w:right w:w="68" w:type="dxa"/>
+            </w:tcMar>
+          </w:tcPr>
+          <w:p>
+            <w:pPr>
+              <w:spacing w:before="8" w:after="8" w:line="198" w:lineRule="auto"/>
             </w:pPr>
             <w:r>
               <w:rPr>
@@ -745,15 +745,15 @@
           <w:tcPr>
             <w:tcW w:w="1900" w:type="dxa"/>
             <w:tcMar>
-              <w:top w:w="28" w:type="dxa"/>
-              <w:bottom w:w="28" w:type="dxa"/>
-              <w:left w:w="65" w:type="dxa"/>
-              <w:right w:w="65" w:type="dxa"/>
-            </w:tcMar>
-          </w:tcPr>
-          <w:p>
-            <w:pPr>
-              <w:spacing w:before="8" w:after="8" w:line="195" w:lineRule="auto"/>
+              <w:top w:w="32" w:type="dxa"/>
+              <w:bottom w:w="32" w:type="dxa"/>
+              <w:left w:w="68" w:type="dxa"/>
+              <w:right w:w="68" w:type="dxa"/>
+            </w:tcMar>
+          </w:tcPr>
+          <w:p>
+            <w:pPr>
+              <w:spacing w:before="8" w:after="8" w:line="198" w:lineRule="auto"/>
             </w:pPr>
             <w:r>
               <w:rPr>
@@ -770,15 +770,15 @@
           <w:tcPr>
             <w:tcW w:w="1500" w:type="dxa"/>
             <w:tcMar>
-              <w:top w:w="28" w:type="dxa"/>
-              <w:bottom w:w="28" w:type="dxa"/>
-              <w:left w:w="65" w:type="dxa"/>
-              <w:right w:w="65" w:type="dxa"/>
-            </w:tcMar>
-          </w:tcPr>
-          <w:p>
-            <w:pPr>
-              <w:spacing w:before="8" w:after="8" w:line="195" w:lineRule="auto"/>
+              <w:top w:w="32" w:type="dxa"/>
+              <w:bottom w:w="32" w:type="dxa"/>
+              <w:left w:w="68" w:type="dxa"/>
+              <w:right w:w="68" w:type="dxa"/>
+            </w:tcMar>
+          </w:tcPr>
+          <w:p>
+            <w:pPr>
+              <w:spacing w:before="8" w:after="8" w:line="198" w:lineRule="auto"/>
             </w:pPr>
             <w:r>
               <w:rPr>
@@ -795,15 +795,15 @@
           <w:tcPr>
             <w:tcW w:w="1300" w:type="dxa"/>
             <w:tcMar>
-              <w:top w:w="28" w:type="dxa"/>
-              <w:bottom w:w="28" w:type="dxa"/>
-              <w:left w:w="65" w:type="dxa"/>
-              <w:right w:w="65" w:type="dxa"/>
-            </w:tcMar>
-          </w:tcPr>
-          <w:p>
-            <w:pPr>
-              <w:spacing w:before="8" w:after="8" w:line="195" w:lineRule="auto"/>
+              <w:top w:w="32" w:type="dxa"/>
+              <w:bottom w:w="32" w:type="dxa"/>
+              <w:left w:w="68" w:type="dxa"/>
+              <w:right w:w="68" w:type="dxa"/>
+            </w:tcMar>
+          </w:tcPr>
+          <w:p>
+            <w:pPr>
+              <w:spacing w:before="8" w:after="8" w:line="198" w:lineRule="auto"/>
             </w:pPr>
             <w:r>
               <w:rPr>
@@ -820,15 +820,15 @@
           <w:tcPr>
             <w:tcW w:w="2112" w:type="dxa"/>
             <w:tcMar>
-              <w:top w:w="28" w:type="dxa"/>
-              <w:bottom w:w="28" w:type="dxa"/>
-              <w:left w:w="65" w:type="dxa"/>
-              <w:right w:w="65" w:type="dxa"/>
-            </w:tcMar>
-          </w:tcPr>
-          <w:p>
-            <w:pPr>
-              <w:spacing w:before="8" w:after="8" w:line="195" w:lineRule="auto"/>
+              <w:top w:w="32" w:type="dxa"/>
+              <w:bottom w:w="32" w:type="dxa"/>
+              <w:left w:w="68" w:type="dxa"/>
+              <w:right w:w="68" w:type="dxa"/>
+            </w:tcMar>
+          </w:tcPr>
+          <w:p>
+            <w:pPr>
+              <w:spacing w:before="8" w:after="8" w:line="198" w:lineRule="auto"/>
             </w:pPr>
             <w:r>
               <w:rPr>
@@ -847,15 +847,15 @@
           <w:tcPr>
             <w:tcW w:w="3700" w:type="dxa"/>
             <w:tcMar>
-              <w:top w:w="28" w:type="dxa"/>
-              <w:bottom w:w="28" w:type="dxa"/>
-              <w:left w:w="65" w:type="dxa"/>
-              <w:right w:w="65" w:type="dxa"/>
-            </w:tcMar>
-          </w:tcPr>
-          <w:p>
-            <w:pPr>
-              <w:spacing w:before="8" w:after="8" w:line="195" w:lineRule="auto"/>
+              <w:top w:w="32" w:type="dxa"/>
+              <w:bottom w:w="32" w:type="dxa"/>
+              <w:left w:w="68" w:type="dxa"/>
+              <w:right w:w="68" w:type="dxa"/>
+            </w:tcMar>
+          </w:tcPr>
+          <w:p>
+            <w:pPr>
+              <w:spacing w:before="8" w:after="8" w:line="198" w:lineRule="auto"/>
             </w:pPr>
             <w:r>
               <w:rPr>
@@ -874,15 +874,15 @@
           <w:tcPr>
             <w:tcW w:w="1900" w:type="dxa"/>
             <w:tcMar>
-              <w:top w:w="28" w:type="dxa"/>
-              <w:bottom w:w="28" w:type="dxa"/>
-              <w:left w:w="65" w:type="dxa"/>
-              <w:right w:w="65" w:type="dxa"/>
-            </w:tcMar>
-          </w:tcPr>
-          <w:p>
-            <w:pPr>
-              <w:spacing w:before="8" w:after="8" w:line="195" w:lineRule="auto"/>
+              <w:top w:w="32" w:type="dxa"/>
+              <w:bottom w:w="32" w:type="dxa"/>
+              <w:left w:w="68" w:type="dxa"/>
+              <w:right w:w="68" w:type="dxa"/>
+            </w:tcMar>
+          </w:tcPr>
+          <w:p>
+            <w:pPr>
+              <w:spacing w:before="8" w:after="8" w:line="198" w:lineRule="auto"/>
             </w:pPr>
             <w:r>
               <w:rPr>
@@ -899,15 +899,15 @@
           <w:tcPr>
             <w:tcW w:w="1500" w:type="dxa"/>
             <w:tcMar>
-              <w:top w:w="28" w:type="dxa"/>
-              <w:bottom w:w="28" w:type="dxa"/>
-              <w:left w:w="65" w:type="dxa"/>
-              <w:right w:w="65" w:type="dxa"/>
-            </w:tcMar>
-          </w:tcPr>
-          <w:p>
-            <w:pPr>
-              <w:spacing w:before="8" w:after="8" w:line="195" w:lineRule="auto"/>
+              <w:top w:w="32" w:type="dxa"/>
+              <w:bottom w:w="32" w:type="dxa"/>
+              <w:left w:w="68" w:type="dxa"/>
+              <w:right w:w="68" w:type="dxa"/>
+            </w:tcMar>
+          </w:tcPr>
+          <w:p>
+            <w:pPr>
+              <w:spacing w:before="8" w:after="8" w:line="198" w:lineRule="auto"/>
             </w:pPr>
             <w:r>
               <w:rPr>
@@ -924,15 +924,15 @@
           <w:tcPr>
             <w:tcW w:w="1300" w:type="dxa"/>
             <w:tcMar>
-              <w:top w:w="28" w:type="dxa"/>
-              <w:bottom w:w="28" w:type="dxa"/>
-              <w:left w:w="65" w:type="dxa"/>
-              <w:right w:w="65" w:type="dxa"/>
-            </w:tcMar>
-          </w:tcPr>
-          <w:p>
-            <w:pPr>
-              <w:spacing w:before="8" w:after="8" w:line="195" w:lineRule="auto"/>
+              <w:top w:w="32" w:type="dxa"/>
+              <w:bottom w:w="32" w:type="dxa"/>
+              <w:left w:w="68" w:type="dxa"/>
+              <w:right w:w="68" w:type="dxa"/>
+            </w:tcMar>
+          </w:tcPr>
+          <w:p>
+            <w:pPr>
+              <w:spacing w:before="8" w:after="8" w:line="198" w:lineRule="auto"/>
             </w:pPr>
             <w:r>
               <w:rPr>
@@ -949,15 +949,15 @@
           <w:tcPr>
             <w:tcW w:w="2112" w:type="dxa"/>
             <w:tcMar>
-              <w:top w:w="28" w:type="dxa"/>
-              <w:bottom w:w="28" w:type="dxa"/>
-              <w:left w:w="65" w:type="dxa"/>
-              <w:right w:w="65" w:type="dxa"/>
-            </w:tcMar>
-          </w:tcPr>
-          <w:p>
-            <w:pPr>
-              <w:spacing w:before="8" w:after="8" w:line="195" w:lineRule="auto"/>
+              <w:top w:w="32" w:type="dxa"/>
+              <w:bottom w:w="32" w:type="dxa"/>
+              <w:left w:w="68" w:type="dxa"/>
+              <w:right w:w="68" w:type="dxa"/>
+            </w:tcMar>
+          </w:tcPr>
+          <w:p>
+            <w:pPr>
+              <w:spacing w:before="8" w:after="8" w:line="198" w:lineRule="auto"/>
             </w:pPr>
             <w:r>
               <w:rPr>
@@ -976,15 +976,15 @@
           <w:tcPr>
             <w:tcW w:w="3700" w:type="dxa"/>
             <w:tcMar>
-              <w:top w:w="28" w:type="dxa"/>
-              <w:bottom w:w="28" w:type="dxa"/>
-              <w:left w:w="65" w:type="dxa"/>
-              <w:right w:w="65" w:type="dxa"/>
-            </w:tcMar>
-          </w:tcPr>
-          <w:p>
-            <w:pPr>
-              <w:spacing w:before="8" w:after="8" w:line="195" w:lineRule="auto"/>
+              <w:top w:w="32" w:type="dxa"/>
+              <w:bottom w:w="32" w:type="dxa"/>
+              <w:left w:w="68" w:type="dxa"/>
+              <w:right w:w="68" w:type="dxa"/>
+            </w:tcMar>
+          </w:tcPr>
+          <w:p>
+            <w:pPr>
+              <w:spacing w:before="8" w:after="8" w:line="198" w:lineRule="auto"/>
             </w:pPr>
             <w:r>
               <w:rPr>
@@ -1003,15 +1003,15 @@
           <w:tcPr>
             <w:tcW w:w="1900" w:type="dxa"/>
             <w:tcMar>
-              <w:top w:w="28" w:type="dxa"/>
-              <w:bottom w:w="28" w:type="dxa"/>
-              <w:left w:w="65" w:type="dxa"/>
-              <w:right w:w="65" w:type="dxa"/>
-            </w:tcMar>
-          </w:tcPr>
-          <w:p>
-            <w:pPr>
-              <w:spacing w:before="8" w:after="8" w:line="195" w:lineRule="auto"/>
+              <w:top w:w="32" w:type="dxa"/>
+              <w:bottom w:w="32" w:type="dxa"/>
+              <w:left w:w="68" w:type="dxa"/>
+              <w:right w:w="68" w:type="dxa"/>
+            </w:tcMar>
+          </w:tcPr>
+          <w:p>
+            <w:pPr>
+              <w:spacing w:before="8" w:after="8" w:line="198" w:lineRule="auto"/>
             </w:pPr>
             <w:r>
               <w:rPr>
@@ -1028,15 +1028,15 @@
           <w:tcPr>
             <w:tcW w:w="1500" w:type="dxa"/>
             <w:tcMar>
-              <w:top w:w="28" w:type="dxa"/>
-              <w:bottom w:w="28" w:type="dxa"/>
-              <w:left w:w="65" w:type="dxa"/>
-              <w:right w:w="65" w:type="dxa"/>
-            </w:tcMar>
-          </w:tcPr>
-          <w:p>
-            <w:pPr>
-              <w:spacing w:before="8" w:after="8" w:line="195" w:lineRule="auto"/>
+              <w:top w:w="32" w:type="dxa"/>
+              <w:bottom w:w="32" w:type="dxa"/>
+              <w:left w:w="68" w:type="dxa"/>
+              <w:right w:w="68" w:type="dxa"/>
+            </w:tcMar>
+          </w:tcPr>
+          <w:p>
+            <w:pPr>
+              <w:spacing w:before="8" w:after="8" w:line="198" w:lineRule="auto"/>
             </w:pPr>
             <w:r>
               <w:rPr>
@@ -1053,15 +1053,15 @@
           <w:tcPr>
             <w:tcW w:w="1300" w:type="dxa"/>
             <w:tcMar>
-              <w:top w:w="28" w:type="dxa"/>
-              <w:bottom w:w="28" w:type="dxa"/>
-              <w:left w:w="65" w:type="dxa"/>
-              <w:right w:w="65" w:type="dxa"/>
-            </w:tcMar>
-          </w:tcPr>
-          <w:p>
-            <w:pPr>
-              <w:spacing w:before="8" w:after="8" w:line="195" w:lineRule="auto"/>
+              <w:top w:w="32" w:type="dxa"/>
+              <w:bottom w:w="32" w:type="dxa"/>
+              <w:left w:w="68" w:type="dxa"/>
+              <w:right w:w="68" w:type="dxa"/>
+            </w:tcMar>
+          </w:tcPr>
+          <w:p>
+            <w:pPr>
+              <w:spacing w:before="8" w:after="8" w:line="198" w:lineRule="auto"/>
             </w:pPr>
             <w:r>
               <w:rPr>
@@ -1078,15 +1078,15 @@
           <w:tcPr>
             <w:tcW w:w="2112" w:type="dxa"/>
             <w:tcMar>
-              <w:top w:w="28" w:type="dxa"/>
-              <w:bottom w:w="28" w:type="dxa"/>
-              <w:left w:w="65" w:type="dxa"/>
-              <w:right w:w="65" w:type="dxa"/>
-            </w:tcMar>
-          </w:tcPr>
-          <w:p>
-            <w:pPr>
-              <w:spacing w:before="8" w:after="8" w:line="195" w:lineRule="auto"/>
+              <w:top w:w="32" w:type="dxa"/>
+              <w:bottom w:w="32" w:type="dxa"/>
+              <w:left w:w="68" w:type="dxa"/>
+              <w:right w:w="68" w:type="dxa"/>
+            </w:tcMar>
+          </w:tcPr>
+          <w:p>
+            <w:pPr>
+              <w:spacing w:before="8" w:after="8" w:line="198" w:lineRule="auto"/>
             </w:pPr>
             <w:r>
               <w:rPr>
@@ -1105,15 +1105,15 @@
           <w:tcPr>
             <w:tcW w:w="3700" w:type="dxa"/>
             <w:tcMar>
-              <w:top w:w="28" w:type="dxa"/>
-              <w:bottom w:w="28" w:type="dxa"/>
-              <w:left w:w="65" w:type="dxa"/>
-              <w:right w:w="65" w:type="dxa"/>
-            </w:tcMar>
-          </w:tcPr>
-          <w:p>
-            <w:pPr>
-              <w:spacing w:before="8" w:after="8" w:line="195" w:lineRule="auto"/>
+              <w:top w:w="32" w:type="dxa"/>
+              <w:bottom w:w="32" w:type="dxa"/>
+              <w:left w:w="68" w:type="dxa"/>
+              <w:right w:w="68" w:type="dxa"/>
+            </w:tcMar>
+          </w:tcPr>
+          <w:p>
+            <w:pPr>
+              <w:spacing w:before="8" w:after="8" w:line="198" w:lineRule="auto"/>
             </w:pPr>
             <w:r>
               <w:rPr>
@@ -1132,15 +1132,15 @@
           <w:tcPr>
             <w:tcW w:w="1900" w:type="dxa"/>
             <w:tcMar>
-              <w:top w:w="28" w:type="dxa"/>
-              <w:bottom w:w="28" w:type="dxa"/>
-              <w:left w:w="65" w:type="dxa"/>
-              <w:right w:w="65" w:type="dxa"/>
-            </w:tcMar>
-          </w:tcPr>
-          <w:p>
-            <w:pPr>
-              <w:spacing w:before="8" w:after="8" w:line="195" w:lineRule="auto"/>
+              <w:top w:w="32" w:type="dxa"/>
+              <w:bottom w:w="32" w:type="dxa"/>
+              <w:left w:w="68" w:type="dxa"/>
+              <w:right w:w="68" w:type="dxa"/>
+            </w:tcMar>
+          </w:tcPr>
+          <w:p>
+            <w:pPr>
+              <w:spacing w:before="8" w:after="8" w:line="198" w:lineRule="auto"/>
             </w:pPr>
             <w:r>
               <w:rPr>
@@ -1157,15 +1157,15 @@
           <w:tcPr>
             <w:tcW w:w="1500" w:type="dxa"/>
             <w:tcMar>
-              <w:top w:w="28" w:type="dxa"/>
-              <w:bottom w:w="28" w:type="dxa"/>
-              <w:left w:w="65" w:type="dxa"/>
-              <w:right w:w="65" w:type="dxa"/>
-            </w:tcMar>
-          </w:tcPr>
-          <w:p>
-            <w:pPr>
-              <w:spacing w:before="8" w:after="8" w:line="195" w:lineRule="auto"/>
+              <w:top w:w="32" w:type="dxa"/>
+              <w:bottom w:w="32" w:type="dxa"/>
+              <w:left w:w="68" w:type="dxa"/>
+              <w:right w:w="68" w:type="dxa"/>
+            </w:tcMar>
+          </w:tcPr>
+          <w:p>
+            <w:pPr>
+              <w:spacing w:before="8" w:after="8" w:line="198" w:lineRule="auto"/>
             </w:pPr>
             <w:r>
               <w:rPr>
@@ -1182,15 +1182,15 @@
           <w:tcPr>
             <w:tcW w:w="1300" w:type="dxa"/>
             <w:tcMar>
-              <w:top w:w="28" w:type="dxa"/>
-              <w:bottom w:w="28" w:type="dxa"/>
-              <w:left w:w="65" w:type="dxa"/>
-              <w:right w:w="65" w:type="dxa"/>
-            </w:tcMar>
-          </w:tcPr>
-          <w:p>
-            <w:pPr>
-              <w:spacing w:before="8" w:after="8" w:line="195" w:lineRule="auto"/>
+              <w:top w:w="32" w:type="dxa"/>
+              <w:bottom w:w="32" w:type="dxa"/>
+              <w:left w:w="68" w:type="dxa"/>
+              <w:right w:w="68" w:type="dxa"/>
+            </w:tcMar>
+          </w:tcPr>
+          <w:p>
+            <w:pPr>
+              <w:spacing w:before="8" w:after="8" w:line="198" w:lineRule="auto"/>
             </w:pPr>
             <w:r>
               <w:rPr>
@@ -1207,15 +1207,15 @@
           <w:tcPr>
             <w:tcW w:w="2112" w:type="dxa"/>
             <w:tcMar>
-              <w:top w:w="28" w:type="dxa"/>
-              <w:bottom w:w="28" w:type="dxa"/>
-              <w:left w:w="65" w:type="dxa"/>
-              <w:right w:w="65" w:type="dxa"/>
-            </w:tcMar>
-          </w:tcPr>
-          <w:p>
-            <w:pPr>
-              <w:spacing w:before="8" w:after="8" w:line="195" w:lineRule="auto"/>
+              <w:top w:w="32" w:type="dxa"/>
+              <w:bottom w:w="32" w:type="dxa"/>
+              <w:left w:w="68" w:type="dxa"/>
+              <w:right w:w="68" w:type="dxa"/>
+            </w:tcMar>
+          </w:tcPr>
+          <w:p>
+            <w:pPr>
+              <w:spacing w:before="8" w:after="8" w:line="198" w:lineRule="auto"/>
             </w:pPr>
             <w:r>
               <w:rPr>
@@ -1251,7 +1251,7 @@
         <w:pBdr>
           <w:bottom w:val="single" w:sz="6" w:space="2" w:color="CBD5E1"/>
         </w:pBdr>
-        <w:spacing w:before="80" w:after="30" w:line="215" w:lineRule="auto"/>
+        <w:spacing w:before="85" w:after="32" w:line="218" w:lineRule="auto"/>
       </w:pPr>
       <w:r>
         <w:rPr>
@@ -1293,7 +1293,7 @@
     <w:p>
       <w:pPr>
         <w:ind w:left="180" w:hanging="180"/>
-        <w:spacing w:before="16" w:after="20" w:line="210" w:lineRule="auto"/>
+        <w:spacing w:before="18" w:after="22" w:line="214" w:lineRule="auto"/>
       </w:pPr>
       <w:r>
         <w:rPr>
@@ -1330,7 +1330,7 @@
     <w:p>
       <w:pPr>
         <w:ind w:left="180" w:hanging="180"/>
-        <w:spacing w:before="16" w:after="20" w:line="210" w:lineRule="auto"/>
+        <w:spacing w:before="18" w:after="22" w:line="214" w:lineRule="auto"/>
       </w:pPr>
       <w:r>
         <w:rPr>
@@ -1367,7 +1367,7 @@
     <w:p>
       <w:pPr>
         <w:ind w:left="180" w:hanging="180"/>
-        <w:spacing w:before="16" w:after="20" w:line="210" w:lineRule="auto"/>
+        <w:spacing w:before="18" w:after="22" w:line="214" w:lineRule="auto"/>
       </w:pPr>
       <w:r>
         <w:rPr>
@@ -1406,7 +1406,7 @@
         <w:pBdr>
           <w:bottom w:val="single" w:sz="6" w:space="2" w:color="CBD5E1"/>
         </w:pBdr>
-        <w:spacing w:before="80" w:after="30" w:line="215" w:lineRule="auto"/>
+        <w:spacing w:before="85" w:after="32" w:line="218" w:lineRule="auto"/>
       </w:pPr>
       <w:r>
         <w:rPr>
@@ -1423,7 +1423,7 @@
     <w:p>
       <w:pPr>
         <w:ind w:left="180" w:hanging="180"/>
-        <w:spacing w:before="16" w:after="20" w:line="210" w:lineRule="auto"/>
+        <w:spacing w:before="18" w:after="22" w:line="214" w:lineRule="auto"/>
       </w:pPr>
       <w:r>
         <w:rPr>
@@ -1460,7 +1460,7 @@
     <w:p>
       <w:pPr>
         <w:ind w:left="180" w:hanging="180"/>
-        <w:spacing w:before="16" w:after="20" w:line="210" w:lineRule="auto"/>
+        <w:spacing w:before="18" w:after="22" w:line="214" w:lineRule="auto"/>
       </w:pPr>
       <w:r>
         <w:rPr>
@@ -1534,7 +1534,7 @@
     <w:p>
       <w:pPr>
         <w:ind w:left="180" w:hanging="180"/>
-        <w:spacing w:before="16" w:after="20" w:line="210" w:lineRule="auto"/>
+        <w:spacing w:before="18" w:after="22" w:line="214" w:lineRule="auto"/>
       </w:pPr>
       <w:r>
         <w:rPr>

</xml_diff>

<commit_message>
Reframe findings (framing A): benchmark against nonbank peers
- Dashboard: What/So What/Now What computed from results; new Overview
  table comparing Fintech with banks and with other nonbanks; robustness
  sentence no longer mixes the nonbank comparator into the bank range;
  --from-json rebuilds the HTML without the loan-level CSV
- analyze_pricing.py: Fintech vs nonbank by borrower segment
  (by_segment_vs_nonbank.csv) and a stated rule for the first review
  segments (nonbank_priority); comparator_* fields label nonbank rows
- Position memo rewritten for the nonbank result; no contradictory
  "survives every check" line; rounding matches the dashboard
- README summary and LLM log updated; new memo tests
</commit_message>
<xml_diff>
--- a/Submit/Project Audible Position Memo.docx
+++ b/Submit/Project Audible Position Memo.docx
@@ -127,7 +127,7 @@
           <w:sz w:val="20"/>
           <w:szCs w:val="20"/>
         </w:rPr>
-        <w:t xml:space="preserve">Recommendation: Yes — launch a member pricing review in Q1 2027, starting with low-down-payment and small loans</w:t>
+        <w:t xml:space="preserve">Recommendation: Yes — a member pricing review benchmarked against nonbank peers, starting with origination fees</w:t>
       </w:r>
     </w:p>
     <w:p>
@@ -141,7 +141,7 @@
           <w:sz w:val="19"/>
           <w:szCs w:val="19"/>
         </w:rPr>
-        <w:t xml:space="preserve">In 2025, borrowers paid more at fintech lenders than at banks for comparable observed loans. </w:t>
+        <w:t xml:space="preserve">In 2025, fintech borrowers paid more than bank borrowers with comparable observed profiles. </w:t>
       </w:r>
       <w:r>
         <w:rPr>
@@ -152,7 +152,7 @@
           <w:sz w:val="19"/>
           <w:szCs w:val="19"/>
         </w:rPr>
-        <w:t xml:space="preserve">The fintech median rate spread was +16.4 bps higher (0.213% vs. 0.049%), </w:t>
+        <w:t xml:space="preserve">The fintech median rate spread was +16.4 bps higher than at banks (0.213% vs. 0.049%), </w:t>
       </w:r>
       <w:r>
         <w:rPr>
@@ -161,7 +161,36 @@
           <w:sz w:val="19"/>
           <w:szCs w:val="19"/>
         </w:rPr>
-        <w:t xml:space="preserve">and the gap appears in all 16 of 16 debt-to-income × loan-to-value groups and in all 20 of the 20 largest states. Under the decision rule agreed in our pitch, a broad and consistent premium calls for a review. AFC should invite members to explain the gap with their own credit-score, rate-lock and fee data, beginning with borrowers putting less than 5% down and loans of $200k or less, where the gap is largest. The review is diagnostic: a price gap alone does not justify telling any member to change prices.</w:t>
+        <w:t xml:space="preserve">in all 16 of 16 debt-to-income × loan-to-value groups and 20 of the 20 largest states. </w:t>
+      </w:r>
+      <w:r>
+        <w:rPr>
+          <w:rFonts w:ascii="Calibri" w:hAnsi="Calibri" w:cs="Calibri"/>
+          <w:b/>
+          <w:bCs/>
+          <w:color w:val="1E293B"/>
+          <w:sz w:val="19"/>
+          <w:szCs w:val="19"/>
+        </w:rPr>
+        <w:t xml:space="preserve">Fintech lenders, however, price in line with other nonbank lenders (-1.2 bps), </w:t>
+      </w:r>
+      <w:r>
+        <w:rPr>
+          <w:rFonts w:ascii="Calibri" w:hAnsi="Calibri" w:cs="Calibri"/>
+          <w:color w:val="1E293B"/>
+          <w:sz w:val="19"/>
+          <w:szCs w:val="19"/>
+        </w:rPr>
+        <w:t xml:space="preserve">so the premium points to the nonbank business model rather than a fintech-specific markup. AFC should run a voluntary review that benchmarks each member against nonbank peers as well as banks, starting with origination fees, where members still charge more than nonbank peers (fees +6.4 bps). </w:t>
+      </w:r>
+      <w:r>
+        <w:rPr>
+          <w:rFonts w:ascii="Calibri" w:hAnsi="Calibri" w:cs="Calibri"/>
+          <w:color w:val="1E293B"/>
+          <w:sz w:val="19"/>
+          <w:szCs w:val="19"/>
+        </w:rPr>
+        <w:t xml:space="preserve">The review is diagnostic: a price gap alone does not justify telling any member to change prices.</w:t>
       </w:r>
     </w:p>
     <w:p>
@@ -208,7 +237,7 @@
           <w:sz w:val="19"/>
           <w:szCs w:val="19"/>
         </w:rPr>
-        <w:t xml:space="preserve">The premium is real and not driven by one lender. </w:t>
+        <w:t xml:space="preserve">Versus banks, the premium is robust. </w:t>
       </w:r>
       <w:r>
         <w:rPr>
@@ -217,7 +246,7 @@
           <w:sz w:val="19"/>
           <w:szCs w:val="19"/>
         </w:rPr>
-        <w:t xml:space="preserve">Sample: 2025 HMDA, conventional conforming 30-year fixed purchase loans; 173,033 loans from 14 fintech lenders (NYU Stern list) vs. 338,166 from 655 banks, with valid borrower data and DTI below 50% (lender-clustered 95% CI: +11.5 bps to +23.3 bps). 12 of 14 fintech lenders price above the bank median (11 by 5 bps or more). Rocket Mortgage is 47% of fintech loans, yet without it every risk cell still shows at least +13.5 bps.</w:t>
+        <w:t xml:space="preserve">Sample: 2025 HMDA conventional conforming 30-year fixed purchase loans; 173,033 loans from 14 fintech lenders (NYU Stern list) vs. 338,166 from 655 banks, valid borrower data, DTI below 50% (lender-clustered 95% CI: +11.5 bps to +23.3 bps). 12 of 14 fintech lenders price above the bank median. Rocket Mortgage is 47% of fintech loans; without it the gap is +17.0 bps.</w:t>
       </w:r>
     </w:p>
     <w:p>
@@ -245,7 +274,7 @@
           <w:sz w:val="19"/>
           <w:szCs w:val="19"/>
         </w:rPr>
-        <w:t xml:space="preserve">Borrowers pay more in both rate and fees. </w:t>
+        <w:t xml:space="preserve">Versus other nonbanks, it largely disappears. </w:t>
       </w:r>
       <w:r>
         <w:rPr>
@@ -254,7 +283,7 @@
           <w:sz w:val="19"/>
           <w:szCs w:val="19"/>
         </w:rPr>
-        <w:t xml:space="preserve">Median interest rate is +12.5 bps higher and median origination charges are +37.2 bps of the loan higher (0.947% vs. 0.575%), roughly $1,117 more upfront on a $300k loan. Higher fees are not buying a lower rate, so the gap is not a points-for-rate trade-off.</w:t>
+        <w:t xml:space="preserve">Compared with 600 non-fintech nonbank lenders (808,681 loans, same filters), the fintech rate-spread gap is -1.2 bps, the rate gap 0.0 bps and the fee gap +6.4 bps. Fees are the one gap that remains.</w:t>
       </w:r>
     </w:p>
     <w:p>
@@ -282,7 +311,7 @@
           <w:sz w:val="19"/>
           <w:szCs w:val="19"/>
         </w:rPr>
-        <w:t xml:space="preserve">The gap concentrates on borrowers with the least room to absorb it. </w:t>
+        <w:t xml:space="preserve">Versus banks, the gap is largest for borrowers with the least room to absorb it. </w:t>
       </w:r>
       <w:r>
         <w:rPr>
@@ -291,7 +320,7 @@
           <w:sz w:val="19"/>
           <w:szCs w:val="19"/>
         </w:rPr>
-        <w:t xml:space="preserve">See the table: borrowers with under 5% down face 2.6 times the gap of borrowers with 20% down, and for borrowers earning $75k or less the premium comes through fees (+55.0 bps) rather than the note rate (+1.0 bps).</w:t>
+        <w:t xml:space="preserve">Borrowers with under 5% down face 2.6 times the gap of borrowers with 20% down; for incomes of $75k or less it comes through fees (+55.0 bps), not the note rate (+1.0 bps).</w:t>
       </w:r>
     </w:p>
     <w:tbl>
@@ -307,16 +336,16 @@
         </w:tblBorders>
       </w:tblPr>
       <w:tblGrid>
-        <w:gridCol w:w="3700"/>
+        <w:gridCol w:w="3000"/>
         <w:gridCol w:w="1900"/>
-        <w:gridCol w:w="1500"/>
-        <w:gridCol w:w="1300"/>
-        <w:gridCol w:w="2112"/>
+        <w:gridCol w:w="1900"/>
+        <w:gridCol w:w="1900"/>
+        <w:gridCol w:w="1812"/>
       </w:tblGrid>
       <w:tr>
         <w:tc>
           <w:tcPr>
-            <w:tcW w:w="3700" w:type="dxa"/>
+            <w:tcW w:w="3000" w:type="dxa"/>
             <w:shd w:val="clear" w:color="auto" w:fill="F1F5F9"/>
             <w:tcMar>
               <w:top w:w="32" w:type="dxa"/>
@@ -338,7 +367,7 @@
                 <w:sz w:val="17"/>
                 <w:szCs w:val="17"/>
               </w:rPr>
-              <w:t xml:space="preserve">Borrower group (dashboard: Overview tab)</w:t>
+              <w:t xml:space="preserve">Borrower group</w:t>
             </w:r>
           </w:p>
         </w:tc>
@@ -372,7 +401,7 @@
         </w:tc>
         <w:tc>
           <w:tcPr>
-            <w:tcW w:w="1500" w:type="dxa"/>
+            <w:tcW w:w="1900" w:type="dxa"/>
             <w:shd w:val="clear" w:color="auto" w:fill="F1F5F9"/>
             <w:tcMar>
               <w:top w:w="32" w:type="dxa"/>
@@ -394,13 +423,13 @@
                 <w:sz w:val="17"/>
                 <w:szCs w:val="17"/>
               </w:rPr>
-              <w:t xml:space="preserve">Rate-spread gap</w:t>
-            </w:r>
-          </w:p>
-        </w:tc>
-        <w:tc>
-          <w:tcPr>
-            <w:tcW w:w="1300" w:type="dxa"/>
+              <w:t xml:space="preserve">Rate-spread gap vs. banks</w:t>
+            </w:r>
+          </w:p>
+        </w:tc>
+        <w:tc>
+          <w:tcPr>
+            <w:tcW w:w="1900" w:type="dxa"/>
             <w:shd w:val="clear" w:color="auto" w:fill="F1F5F9"/>
             <w:tcMar>
               <w:top w:w="32" w:type="dxa"/>
@@ -422,13 +451,13 @@
                 <w:sz w:val="17"/>
                 <w:szCs w:val="17"/>
               </w:rPr>
-              <w:t xml:space="preserve">Rate gap</w:t>
-            </w:r>
-          </w:p>
-        </w:tc>
-        <w:tc>
-          <w:tcPr>
-            <w:tcW w:w="2112" w:type="dxa"/>
+              <w:t xml:space="preserve">Rate-spread gap vs. nonbanks</w:t>
+            </w:r>
+          </w:p>
+        </w:tc>
+        <w:tc>
+          <w:tcPr>
+            <w:tcW w:w="1812" w:type="dxa"/>
             <w:shd w:val="clear" w:color="auto" w:fill="F1F5F9"/>
             <w:tcMar>
               <w:top w:w="32" w:type="dxa"/>
@@ -450,7 +479,7 @@
                 <w:sz w:val="17"/>
                 <w:szCs w:val="17"/>
               </w:rPr>
-              <w:t xml:space="preserve">Fee gap (% of loan)</w:t>
+              <w:t xml:space="preserve">Fee gap vs. nonbanks</w:t>
             </w:r>
           </w:p>
         </w:tc>
@@ -458,7 +487,7 @@
       <w:tr>
         <w:tc>
           <w:tcPr>
-            <w:tcW w:w="3700" w:type="dxa"/>
+            <w:tcW w:w="3000" w:type="dxa"/>
             <w:tcMar>
               <w:top w:w="32" w:type="dxa"/>
               <w:bottom w:w="32" w:type="dxa"/>
@@ -479,7 +508,7 @@
                 <w:sz w:val="17"/>
                 <w:szCs w:val="17"/>
               </w:rPr>
-              <w:t xml:space="preserve">All comparable loans (baseline)</w:t>
+              <w:t xml:space="preserve">All comparable loans</w:t>
             </w:r>
           </w:p>
         </w:tc>
@@ -510,7 +539,7 @@
         </w:tc>
         <w:tc>
           <w:tcPr>
-            <w:tcW w:w="1500" w:type="dxa"/>
+            <w:tcW w:w="1900" w:type="dxa"/>
             <w:tcMar>
               <w:top w:w="32" w:type="dxa"/>
               <w:bottom w:w="32" w:type="dxa"/>
@@ -535,7 +564,7 @@
         </w:tc>
         <w:tc>
           <w:tcPr>
-            <w:tcW w:w="1300" w:type="dxa"/>
+            <w:tcW w:w="1900" w:type="dxa"/>
             <w:tcMar>
               <w:top w:w="32" w:type="dxa"/>
               <w:bottom w:w="32" w:type="dxa"/>
@@ -554,13 +583,13 @@
                 <w:sz w:val="17"/>
                 <w:szCs w:val="17"/>
               </w:rPr>
-              <w:t xml:space="preserve">+12.5 bps</w:t>
-            </w:r>
-          </w:p>
-        </w:tc>
-        <w:tc>
-          <w:tcPr>
-            <w:tcW w:w="2112" w:type="dxa"/>
+              <w:t xml:space="preserve">-1.2 bps</w:t>
+            </w:r>
+          </w:p>
+        </w:tc>
+        <w:tc>
+          <w:tcPr>
+            <w:tcW w:w="1812" w:type="dxa"/>
             <w:tcMar>
               <w:top w:w="32" w:type="dxa"/>
               <w:bottom w:w="32" w:type="dxa"/>
@@ -579,7 +608,7 @@
                 <w:sz w:val="17"/>
                 <w:szCs w:val="17"/>
               </w:rPr>
-              <w:t xml:space="preserve">+37.2 bps</w:t>
+              <w:t xml:space="preserve">+6.4 bps</w:t>
             </w:r>
           </w:p>
         </w:tc>
@@ -587,7 +616,7 @@
       <w:tr>
         <w:tc>
           <w:tcPr>
-            <w:tcW w:w="3700" w:type="dxa"/>
+            <w:tcW w:w="3000" w:type="dxa"/>
             <w:tcMar>
               <w:top w:w="32" w:type="dxa"/>
               <w:bottom w:w="32" w:type="dxa"/>
@@ -639,7 +668,7 @@
         </w:tc>
         <w:tc>
           <w:tcPr>
-            <w:tcW w:w="1500" w:type="dxa"/>
+            <w:tcW w:w="1900" w:type="dxa"/>
             <w:tcMar>
               <w:top w:w="32" w:type="dxa"/>
               <w:bottom w:w="32" w:type="dxa"/>
@@ -664,7 +693,7 @@
         </w:tc>
         <w:tc>
           <w:tcPr>
-            <w:tcW w:w="1300" w:type="dxa"/>
+            <w:tcW w:w="1900" w:type="dxa"/>
             <w:tcMar>
               <w:top w:w="32" w:type="dxa"/>
               <w:bottom w:w="32" w:type="dxa"/>
@@ -683,13 +712,13 @@
                 <w:sz w:val="17"/>
                 <w:szCs w:val="17"/>
               </w:rPr>
-              <w:t xml:space="preserve">+7.5 bps</w:t>
-            </w:r>
-          </w:p>
-        </w:tc>
-        <w:tc>
-          <w:tcPr>
-            <w:tcW w:w="2112" w:type="dxa"/>
+              <w:t xml:space="preserve">rerun</w:t>
+            </w:r>
+          </w:p>
+        </w:tc>
+        <w:tc>
+          <w:tcPr>
+            <w:tcW w:w="1812" w:type="dxa"/>
             <w:tcMar>
               <w:top w:w="32" w:type="dxa"/>
               <w:bottom w:w="32" w:type="dxa"/>
@@ -708,7 +737,7 @@
                 <w:sz w:val="17"/>
                 <w:szCs w:val="17"/>
               </w:rPr>
-              <w:t xml:space="preserve">+34.2 bps</w:t>
+              <w:t xml:space="preserve">rerun</w:t>
             </w:r>
           </w:p>
         </w:tc>
@@ -716,7 +745,7 @@
       <w:tr>
         <w:tc>
           <w:tcPr>
-            <w:tcW w:w="3700" w:type="dxa"/>
+            <w:tcW w:w="3000" w:type="dxa"/>
             <w:tcMar>
               <w:top w:w="32" w:type="dxa"/>
               <w:bottom w:w="32" w:type="dxa"/>
@@ -768,7 +797,7 @@
         </w:tc>
         <w:tc>
           <w:tcPr>
-            <w:tcW w:w="1500" w:type="dxa"/>
+            <w:tcW w:w="1900" w:type="dxa"/>
             <w:tcMar>
               <w:top w:w="32" w:type="dxa"/>
               <w:bottom w:w="32" w:type="dxa"/>
@@ -793,7 +822,7 @@
         </w:tc>
         <w:tc>
           <w:tcPr>
-            <w:tcW w:w="1300" w:type="dxa"/>
+            <w:tcW w:w="1900" w:type="dxa"/>
             <w:tcMar>
               <w:top w:w="32" w:type="dxa"/>
               <w:bottom w:w="32" w:type="dxa"/>
@@ -812,13 +841,13 @@
                 <w:sz w:val="17"/>
                 <w:szCs w:val="17"/>
               </w:rPr>
-              <w:t xml:space="preserve">+25.0 bps</w:t>
-            </w:r>
-          </w:p>
-        </w:tc>
-        <w:tc>
-          <w:tcPr>
-            <w:tcW w:w="2112" w:type="dxa"/>
+              <w:t xml:space="preserve">rerun</w:t>
+            </w:r>
+          </w:p>
+        </w:tc>
+        <w:tc>
+          <w:tcPr>
+            <w:tcW w:w="1812" w:type="dxa"/>
             <w:tcMar>
               <w:top w:w="32" w:type="dxa"/>
               <w:bottom w:w="32" w:type="dxa"/>
@@ -837,7 +866,7 @@
                 <w:sz w:val="17"/>
                 <w:szCs w:val="17"/>
               </w:rPr>
-              <w:t xml:space="preserve">+42.5 bps</w:t>
+              <w:t xml:space="preserve">rerun</w:t>
             </w:r>
           </w:p>
         </w:tc>
@@ -845,7 +874,7 @@
       <w:tr>
         <w:tc>
           <w:tcPr>
-            <w:tcW w:w="3700" w:type="dxa"/>
+            <w:tcW w:w="3000" w:type="dxa"/>
             <w:tcMar>
               <w:top w:w="32" w:type="dxa"/>
               <w:bottom w:w="32" w:type="dxa"/>
@@ -897,7 +926,7 @@
         </w:tc>
         <w:tc>
           <w:tcPr>
-            <w:tcW w:w="1500" w:type="dxa"/>
+            <w:tcW w:w="1900" w:type="dxa"/>
             <w:tcMar>
               <w:top w:w="32" w:type="dxa"/>
               <w:bottom w:w="32" w:type="dxa"/>
@@ -916,13 +945,13 @@
                 <w:sz w:val="17"/>
                 <w:szCs w:val="17"/>
               </w:rPr>
-              <w:t xml:space="preserve">+21.4 bps</w:t>
-            </w:r>
-          </w:p>
-        </w:tc>
-        <w:tc>
-          <w:tcPr>
-            <w:tcW w:w="1300" w:type="dxa"/>
+              <w:t xml:space="preserve">+21.5 bps</w:t>
+            </w:r>
+          </w:p>
+        </w:tc>
+        <w:tc>
+          <w:tcPr>
+            <w:tcW w:w="1900" w:type="dxa"/>
             <w:tcMar>
               <w:top w:w="32" w:type="dxa"/>
               <w:bottom w:w="32" w:type="dxa"/>
@@ -941,13 +970,13 @@
                 <w:sz w:val="17"/>
                 <w:szCs w:val="17"/>
               </w:rPr>
-              <w:t xml:space="preserve">+12.5 bps</w:t>
-            </w:r>
-          </w:p>
-        </w:tc>
-        <w:tc>
-          <w:tcPr>
-            <w:tcW w:w="2112" w:type="dxa"/>
+              <w:t xml:space="preserve">rerun</w:t>
+            </w:r>
+          </w:p>
+        </w:tc>
+        <w:tc>
+          <w:tcPr>
+            <w:tcW w:w="1812" w:type="dxa"/>
             <w:tcMar>
               <w:top w:w="32" w:type="dxa"/>
               <w:bottom w:w="32" w:type="dxa"/>
@@ -966,7 +995,7 @@
                 <w:sz w:val="17"/>
                 <w:szCs w:val="17"/>
               </w:rPr>
-              <w:t xml:space="preserve">+64.0 bps</w:t>
+              <w:t xml:space="preserve">rerun</w:t>
             </w:r>
           </w:p>
         </w:tc>
@@ -974,7 +1003,7 @@
       <w:tr>
         <w:tc>
           <w:tcPr>
-            <w:tcW w:w="3700" w:type="dxa"/>
+            <w:tcW w:w="3000" w:type="dxa"/>
             <w:tcMar>
               <w:top w:w="32" w:type="dxa"/>
               <w:bottom w:w="32" w:type="dxa"/>
@@ -1026,7 +1055,7 @@
         </w:tc>
         <w:tc>
           <w:tcPr>
-            <w:tcW w:w="1500" w:type="dxa"/>
+            <w:tcW w:w="1900" w:type="dxa"/>
             <w:tcMar>
               <w:top w:w="32" w:type="dxa"/>
               <w:bottom w:w="32" w:type="dxa"/>
@@ -1051,7 +1080,7 @@
         </w:tc>
         <w:tc>
           <w:tcPr>
-            <w:tcW w:w="1300" w:type="dxa"/>
+            <w:tcW w:w="1900" w:type="dxa"/>
             <w:tcMar>
               <w:top w:w="32" w:type="dxa"/>
               <w:bottom w:w="32" w:type="dxa"/>
@@ -1070,13 +1099,13 @@
                 <w:sz w:val="17"/>
                 <w:szCs w:val="17"/>
               </w:rPr>
-              <w:t xml:space="preserve">+1.0 bps</w:t>
-            </w:r>
-          </w:p>
-        </w:tc>
-        <w:tc>
-          <w:tcPr>
-            <w:tcW w:w="2112" w:type="dxa"/>
+              <w:t xml:space="preserve">rerun</w:t>
+            </w:r>
+          </w:p>
+        </w:tc>
+        <w:tc>
+          <w:tcPr>
+            <w:tcW w:w="1812" w:type="dxa"/>
             <w:tcMar>
               <w:top w:w="32" w:type="dxa"/>
               <w:bottom w:w="32" w:type="dxa"/>
@@ -1095,7 +1124,7 @@
                 <w:sz w:val="17"/>
                 <w:szCs w:val="17"/>
               </w:rPr>
-              <w:t xml:space="preserve">+55.0 bps</w:t>
+              <w:t xml:space="preserve">rerun</w:t>
             </w:r>
           </w:p>
         </w:tc>
@@ -1103,7 +1132,7 @@
       <w:tr>
         <w:tc>
           <w:tcPr>
-            <w:tcW w:w="3700" w:type="dxa"/>
+            <w:tcW w:w="3000" w:type="dxa"/>
             <w:tcMar>
               <w:top w:w="32" w:type="dxa"/>
               <w:bottom w:w="32" w:type="dxa"/>
@@ -1155,7 +1184,7 @@
         </w:tc>
         <w:tc>
           <w:tcPr>
-            <w:tcW w:w="1500" w:type="dxa"/>
+            <w:tcW w:w="1900" w:type="dxa"/>
             <w:tcMar>
               <w:top w:w="32" w:type="dxa"/>
               <w:bottom w:w="32" w:type="dxa"/>
@@ -1180,7 +1209,7 @@
         </w:tc>
         <w:tc>
           <w:tcPr>
-            <w:tcW w:w="1300" w:type="dxa"/>
+            <w:tcW w:w="1900" w:type="dxa"/>
             <w:tcMar>
               <w:top w:w="32" w:type="dxa"/>
               <w:bottom w:w="32" w:type="dxa"/>
@@ -1199,13 +1228,13 @@
                 <w:sz w:val="17"/>
                 <w:szCs w:val="17"/>
               </w:rPr>
-              <w:t xml:space="preserve">+4.5 bps</w:t>
-            </w:r>
-          </w:p>
-        </w:tc>
-        <w:tc>
-          <w:tcPr>
-            <w:tcW w:w="2112" w:type="dxa"/>
+              <w:t xml:space="preserve">rerun</w:t>
+            </w:r>
+          </w:p>
+        </w:tc>
+        <w:tc>
+          <w:tcPr>
+            <w:tcW w:w="1812" w:type="dxa"/>
             <w:tcMar>
               <w:top w:w="32" w:type="dxa"/>
               <w:bottom w:w="32" w:type="dxa"/>
@@ -1224,7 +1253,7 @@
                 <w:sz w:val="17"/>
                 <w:szCs w:val="17"/>
               </w:rPr>
-              <w:t xml:space="preserve">+19.3 bps</w:t>
+              <w:t xml:space="preserve">rerun</w:t>
             </w:r>
           </w:p>
         </w:tc>
@@ -1243,7 +1272,7 @@
           <w:sz w:val="16"/>
           <w:szCs w:val="16"/>
         </w:rPr>
-        <w:t xml:space="preserve">Gap = Fintech median − Bank median. Rate spread = APR − APOR (benchmark rate on the lock date). Source: FFIEC 2025 HMDA snapshot; full detail in the dashboard and technical memo.</w:t>
+        <w:t xml:space="preserve">Gap = Fintech median − comparator median. Rate spread = APR − APOR (benchmark rate on the lock date). Nonbanks = non-fintech independent mortgage banks (Philadelphia Fed TYPE 40/41). Source: FFIEC 2025 HMDA; dashboard Overview tab and technical memo. "rerun" = segment benchmark not yet computed; rerun analyze_pricing.py.</w:t>
       </w:r>
     </w:p>
     <w:p>
@@ -1287,7 +1316,7 @@
           <w:sz w:val="19"/>
           <w:szCs w:val="19"/>
         </w:rPr>
-        <w:t xml:space="preserve">the largest premiums fall on borrowers with the least room to absorb extra cost: small down payments, small loans, lower incomes. The gap is visible to anyone with public HMDA data, including regulators and the press. Investigating it first lets AFC lead the answer instead of reacting to someone else’s.</w:t>
+        <w:t xml:space="preserve">anyone with public HMDA data, including regulators and the press, will compare fintech lenders with banks and see a premium that is largest for small down payments and small loans. Our data suggest the fair comparison is with other nonbanks, where members look similar, but only member data can show that. Running the review first lets AFC lead the answer instead of reacting to someone else’s.</w:t>
       </w:r>
     </w:p>
     <w:p>
@@ -1324,7 +1353,7 @@
           <w:sz w:val="19"/>
           <w:szCs w:val="19"/>
         </w:rPr>
-        <w:t xml:space="preserve">invite participating members to join; publish this HMDA benchmark and the priority groups.</w:t>
+        <w:t xml:space="preserve">invite members to join; publish the HMDA benchmarks against banks and nonbank peers.</w:t>
       </w:r>
     </w:p>
     <w:p>
@@ -1361,7 +1390,7 @@
           <w:sz w:val="19"/>
           <w:szCs w:val="19"/>
         </w:rPr>
-        <w:t xml:space="preserve">each member decomposes its gap in the CLTV &gt;95% and ≤$200k groups using credit score, LLPAs, rate-lock date, discount points and lender credits that public HMDA omits.</w:t>
+        <w:t xml:space="preserve">each member explains its gap, starting with origination fees, using credit score, LLPAs, rate-lock date, discount points and lender credits that public HMDA omits.</w:t>
       </w:r>
     </w:p>
     <w:p>
@@ -1398,7 +1427,7 @@
           <w:sz w:val="19"/>
           <w:szCs w:val="19"/>
         </w:rPr>
-        <w:t xml:space="preserve">AFC reports, in aggregate, how much of the gap credit risk explains and how much it does not; members act only on the unexplained part. If credit risk explains most of it, AFC publishes that as evidence.</w:t>
+        <w:t xml:space="preserve">AFC reports, in aggregate, how much of the gap credit risk and the nonbank model explain; members act only on the unexplained part. If little is left, AFC publishes that as evidence.</w:t>
       </w:r>
     </w:p>
     <w:p>
@@ -1445,7 +1474,7 @@
           <w:sz w:val="19"/>
           <w:szCs w:val="19"/>
         </w:rPr>
-        <w:t xml:space="preserve">Objection — "Fintech borrowers are riskier." </w:t>
+        <w:t xml:space="preserve">Objection — "This is a nonbank pattern, so why review fintech members?" </w:t>
       </w:r>
       <w:r>
         <w:rPr>
@@ -1454,7 +1483,7 @@
           <w:sz w:val="19"/>
           <w:szCs w:val="19"/>
         </w:rPr>
-        <w:t xml:space="preserve">Public HMDA has no credit scores, and risk-based pricing is steepest at high loan-to-value, exactly where the gap is largest. But the gap appears within every DTI × CLTV group and in 198 of 200 groups split four ways (DTI, CLTV, income, loan size), and fees are higher too. Credit scores are what the review asks members to supply; the objection is a reason to run the review, not to skip it.</w:t>
+        <w:t xml:space="preserve">On the rate spread we agree, which is why the benchmark is nonbank peers and the review is voluntary and diagnostic. Fees still sit +6.4 bps above nonbank peers, and borrowers will still compare members with banks.</w:t>
       </w:r>
     </w:p>
     <w:p>
@@ -1482,7 +1511,7 @@
           <w:sz w:val="19"/>
           <w:szCs w:val="19"/>
         </w:rPr>
-        <w:t xml:space="preserve">Limitation — who counts as "fintech." </w:t>
+        <w:t xml:space="preserve">Limitation — data and definitions. </w:t>
       </w:r>
       <w:r>
         <w:rPr>
@@ -1491,44 +1520,7 @@
           <w:sz w:val="19"/>
           <w:szCs w:val="19"/>
         </w:rPr>
-        <w:t xml:space="preserve">We use the NYU Stern / Fuster et al. (2019) list of lenders with fully online applications, last updated in 2017; it matches 15 of its 18 lenders in 2025, all of them nonbanks, while the comparator is banks only. </w:t>
-      </w:r>
-    </w:p>
-    <w:p>
-      <w:pPr>
-        <w:ind w:left="180" w:hanging="0"/>
-        <w:spacing w:before="0" w:after="30" w:line="228" w:lineRule="auto"/>
-      </w:pPr>
-      <w:r>
-        <w:rPr>
-          <w:rFonts w:ascii="Calibri" w:hAnsi="Calibri" w:cs="Calibri"/>
-          <w:b/>
-          <w:bCs/>
-          <w:color w:val="1E293B"/>
-          <w:sz w:val="19"/>
-          <w:szCs w:val="19"/>
-        </w:rPr>
-        <w:t xml:space="preserve"/>
-      </w:r>
-      <w:r>
-        <w:rPr>
-          <w:rFonts w:ascii="Calibri" w:hAnsi="Calibri" w:cs="Calibri"/>
-          <w:b/>
-          <w:bCs/>
-          <w:color w:val="1E293B"/>
-          <w:sz w:val="19"/>
-          <w:szCs w:val="19"/>
-        </w:rPr>
-        <w:t xml:space="preserve">Against non-fintech independent mortgage banks (600 lenders, 808,681 loans, same filters), the Fintech gap is -1.2 bps. </w:t>
-      </w:r>
-      <w:r>
-        <w:rPr>
-          <w:rFonts w:ascii="Calibri" w:hAnsi="Calibri" w:cs="Calibri"/>
-          <w:color w:val="1E293B"/>
-          <w:sz w:val="19"/>
-          <w:szCs w:val="19"/>
-        </w:rPr>
-        <w:t xml:space="preserve">Against other nonbanks the premium largely disappears, so the gap is mainly a nonbank effect. Borrowers still pay more than at banks, so the review stands, but members should be benchmarked against nonbank peers.</w:t>
+        <w:t xml:space="preserve">Public HMDA has no credit scores or exact lock dates, and risk-based pricing is steepest at high loan-to-value. "Fintech" is the NYU Stern / Fuster et al. (2019) list of fully online lenders, last updated in 2017 (15 of 18 matched in 2025). Some unlisted nonbanks also originate online, which pulls the fintech-versus-nonbank gap toward zero.</w:t>
       </w:r>
     </w:p>
     <w:p>
@@ -1565,7 +1557,7 @@
           <w:sz w:val="19"/>
           <w:szCs w:val="19"/>
         </w:rPr>
-        <w:t xml:space="preserve">the result survives every robustness check run (excluding Rocket, site-built homes only, flagged loans removed, unadjusted sample), and 3 fintech lenders (American Internet Mortgage, Inc., Acrisure Mortgage, LLC, loanDepot.com LLC) price within 5 bps of the bank median or below it, so bank-level pricing is achievable online. The recommended action is low-cost, voluntary and diagnostic. HMDA describes 2025 pricing, not current offers.</w:t>
+        <w:t xml:space="preserve">versus banks the gap stays between +15.9 bps and +17.2 bps across every sample definition we tested, and in 198 of 200 groups split four ways (DTI, CLTV, income, loan size). The recommendation follows the evidence: it benchmarks members against their real peers instead of assuming a fintech markup, it targets the gap that remains, and it is low-cost and voluntary. HMDA describes 2025 pricing, not current offers.</w:t>
       </w:r>
     </w:p>
     <w:sectPr>

</xml_diff>

<commit_message>
Rerun analysis pipeline, dashboard, and position memo for framing-a
</commit_message>
<xml_diff>
--- a/Submit/Project Audible Position Memo.docx
+++ b/Submit/Project Audible Position Memo.docx
@@ -127,7 +127,7 @@
           <w:sz w:val="20"/>
           <w:szCs w:val="20"/>
         </w:rPr>
-        <w:t xml:space="preserve">Recommendation: Yes — a member pricing review benchmarked against nonbank peers, starting with origination fees</w:t>
+        <w:t xml:space="preserve">Recommendation: Yes — a member pricing review benchmarked against nonbank peers, starting with origination fees, first in loans ≤$200k and income ≤$75k</w:t>
       </w:r>
     </w:p>
     <w:p>
@@ -181,7 +181,7 @@
           <w:sz w:val="19"/>
           <w:szCs w:val="19"/>
         </w:rPr>
-        <w:t xml:space="preserve">so the premium points to the nonbank business model rather than a fintech-specific markup. AFC should run a voluntary review that benchmarks each member against nonbank peers as well as banks, starting with origination fees, where members still charge more than nonbank peers (fees +6.4 bps). </w:t>
+        <w:t xml:space="preserve">so the premium points to the nonbank business model rather than a fintech-specific markup. AFC should run a voluntary review that benchmarks each member against nonbank peers as well as banks, starting with origination fees, first in loans ≤$200k and income ≤$75k, where members still charge more than nonbank peers (fees +6.4 bps). </w:t>
       </w:r>
       <w:r>
         <w:rPr>
@@ -712,7 +712,7 @@
                 <w:sz w:val="17"/>
                 <w:szCs w:val="17"/>
               </w:rPr>
-              <w:t xml:space="preserve">rerun</w:t>
+              <w:t xml:space="preserve">-2.4 bps</w:t>
             </w:r>
           </w:p>
         </w:tc>
@@ -737,7 +737,7 @@
                 <w:sz w:val="17"/>
                 <w:szCs w:val="17"/>
               </w:rPr>
-              <w:t xml:space="preserve">rerun</w:t>
+              <w:t xml:space="preserve">+2.7 bps</w:t>
             </w:r>
           </w:p>
         </w:tc>
@@ -841,7 +841,7 @@
                 <w:sz w:val="17"/>
                 <w:szCs w:val="17"/>
               </w:rPr>
-              <w:t xml:space="preserve">rerun</w:t>
+              <w:t xml:space="preserve">+2.4 bps</w:t>
             </w:r>
           </w:p>
         </w:tc>
@@ -866,7 +866,7 @@
                 <w:sz w:val="17"/>
                 <w:szCs w:val="17"/>
               </w:rPr>
-              <w:t xml:space="preserve">rerun</w:t>
+              <w:t xml:space="preserve">+9.0 bps</w:t>
             </w:r>
           </w:p>
         </w:tc>
@@ -970,7 +970,7 @@
                 <w:sz w:val="17"/>
                 <w:szCs w:val="17"/>
               </w:rPr>
-              <w:t xml:space="preserve">rerun</w:t>
+              <w:t xml:space="preserve">+4.2 bps</w:t>
             </w:r>
           </w:p>
         </w:tc>
@@ -995,7 +995,7 @@
                 <w:sz w:val="17"/>
                 <w:szCs w:val="17"/>
               </w:rPr>
-              <w:t xml:space="preserve">rerun</w:t>
+              <w:t xml:space="preserve">+17.8 bps</w:t>
             </w:r>
           </w:p>
         </w:tc>
@@ -1099,7 +1099,7 @@
                 <w:sz w:val="17"/>
                 <w:szCs w:val="17"/>
               </w:rPr>
-              <w:t xml:space="preserve">rerun</w:t>
+              <w:t xml:space="preserve">+1.4 bps</w:t>
             </w:r>
           </w:p>
         </w:tc>
@@ -1124,7 +1124,7 @@
                 <w:sz w:val="17"/>
                 <w:szCs w:val="17"/>
               </w:rPr>
-              <w:t xml:space="preserve">rerun</w:t>
+              <w:t xml:space="preserve">+14.5 bps</w:t>
             </w:r>
           </w:p>
         </w:tc>
@@ -1228,7 +1228,7 @@
                 <w:sz w:val="17"/>
                 <w:szCs w:val="17"/>
               </w:rPr>
-              <w:t xml:space="preserve">rerun</w:t>
+              <w:t xml:space="preserve">-4.7 bps</w:t>
             </w:r>
           </w:p>
         </w:tc>
@@ -1253,7 +1253,7 @@
                 <w:sz w:val="17"/>
                 <w:szCs w:val="17"/>
               </w:rPr>
-              <w:t xml:space="preserve">rerun</w:t>
+              <w:t xml:space="preserve">-6.9 bps</w:t>
             </w:r>
           </w:p>
         </w:tc>
@@ -1272,7 +1272,7 @@
           <w:sz w:val="16"/>
           <w:szCs w:val="16"/>
         </w:rPr>
-        <w:t xml:space="preserve">Gap = Fintech median − comparator median. Rate spread = APR − APOR (benchmark rate on the lock date). Nonbanks = non-fintech independent mortgage banks (Philadelphia Fed TYPE 40/41). Source: FFIEC 2025 HMDA; dashboard Overview tab and technical memo. "rerun" = segment benchmark not yet computed; rerun analyze_pricing.py.</w:t>
+        <w:t xml:space="preserve">Gap = Fintech median − comparator median. Rate spread = APR − APOR (benchmark rate on the lock date). Nonbanks = non-fintech independent mortgage banks (Philadelphia Fed TYPE 40/41). Source: FFIEC 2025 HMDA; dashboard Overview tab and technical memo.</w:t>
       </w:r>
     </w:p>
     <w:p>
@@ -1390,7 +1390,7 @@
           <w:sz w:val="19"/>
           <w:szCs w:val="19"/>
         </w:rPr>
-        <w:t xml:space="preserve">each member explains its gap, starting with origination fees, using credit score, LLPAs, rate-lock date, discount points and lender credits that public HMDA omits.</w:t>
+        <w:t xml:space="preserve">each member explains its gap, starting with origination fees, first in loans ≤$200k and income ≤$75k, using credit score, LLPAs, rate-lock date, discount points and lender credits that public HMDA omits.</w:t>
       </w:r>
     </w:p>
     <w:p>

</xml_diff>